<commit_message>
docs(v2): fusion du cahier des charges V2 dans le .docx (section 10, phase 4)
Co-Authored-By: Claude Sonnet 5.5 <noreply@anthropic.com>
Claude-Session: https://claude.ai/code/session_01Qwve3UPbfW6QokeFdjpqi4
</commit_message>
<xml_diff>
--- a/docs/Cahier des charges – Coach Trail.docx
+++ b/docs/Cahier des charges – Coach Trail.docx
@@ -13,13 +13,7 @@
     <w:p>
       <w:pPr/>
       <w:r>
-        <w:t xml:space="preserve">Oct 26, 2026</w:t>
-      </w:r>
-      <w:r>
-        <w:t xml:space="preserve"> · </w:t>
-      </w:r>
-      <w:r>
-        <w:t xml:space="preserve">@Antoine Gautier</w:t>
+        <w:t xml:space="preserve">Oct 26, 2026 · @Antoine Gautier</w:t>
       </w:r>
     </w:p>
     <w:p>
@@ -2050,7 +2044,7 @@
         </w:numPr>
       </w:pPr>
       <w:r>
-        <w:t xml:space="preserve">Plusieurs pages : barre d'onglets fixe, création, renommage, duplication et réorganisation des pages, raccourcis clavier (1 à 9) pour y accéder. Une page est désignée comme accueil.</w:t>
+        <w:t xml:space="preserve">Plusieurs pages : barre d'onglets fixe, création, renommage, duplication, réorganisation et suppression (menu ⋯) des pages. Raccourcis clavier : touches 1 à 9 du pavé numérique et rangée AZERTY &amp; é " ' ( - è _ ç à (pages 1 à 10). Une page est désignée comme accueil. Deux pages intégrées et fixes, Courses et Calendrier, complètent les pages à widgets (voir section 10).</w:t>
       </w:r>
     </w:p>
     <w:p>
@@ -3677,10 +3671,279 @@
     </w:p>
     <w:p>
       <w:pPr>
+        <w:pStyle w:val="ListParagraph"/>
+        <w:numPr>
+          <w:ilvl w:val="0"/>
+          <w:numId w:val="13"/>
+        </w:numPr>
+      </w:pPr>
+      <w:r>
+        <w:rPr>
+          <w:b/>
+        </w:rPr>
+        <w:t xml:space="preserve">Phase 4 – V2, carnet de bord (4 étapes).</w:t>
+      </w:r>
+      <w:r>
+        <w:t xml:space="preserve"> Corrections de navigation et synchronisation rapide, plans rattachés aux courses, calendrier navigable, import unique et documentation visuelle (section 10). </w:t>
+      </w:r>
+      <w:r>
+        <w:rPr>
+          <w:i/>
+        </w:rPr>
+        <w:t xml:space="preserve">Critère : un plan collé depuis Claude apparaît dans le calendrier et sur la page Courses, et le plan suivant peut être importé à l'avance sans toucher au premier.</w:t>
+      </w:r>
+    </w:p>
+    <w:p>
+      <w:pPr>
         <w:pStyle w:val="Heading2"/>
       </w:pPr>
       <w:r>
-        <w:t xml:space="preserve">10. Questions ouvertes et sources</w:t>
+        <w:t xml:space="preserve">10. Évolutions V2 : le carnet de bord</w:t>
+      </w:r>
+    </w:p>
+    <w:p>
+      <w:pPr/>
+      <w:r>
+        <w:t xml:space="preserve">Intention. Coach Trail est un carnet de bord visuel de l'entraînement : le coach (projet Claude) décide, l'appli garde et affiche ce qu'il a dit, pour ne plus fouiller les conversations. Trois besoins : retrouver le plan validé sans rien chercher, importer sans friction (coller, vérifier, valider), et alimenter le coach à la demande. Principe : simple d'abord. Stack, sources, règles métriques et sécurité inchangées.</w:t>
+      </w:r>
+    </w:p>
+    <w:p>
+      <w:pPr/>
+      <w:r>
+        <w:rPr>
+          <w:b/>
+        </w:rPr>
+        <w:t xml:space="preserve">Navigation et pages</w:t>
+      </w:r>
+    </w:p>
+    <w:p>
+      <w:pPr>
+        <w:pStyle w:val="ListParagraph"/>
+        <w:numPr>
+          <w:ilvl w:val="0"/>
+          <w:numId w:val="6"/>
+        </w:numPr>
+      </w:pPr>
+      <w:r>
+        <w:rPr>
+          <w:b/>
+        </w:rPr>
+        <w:t xml:space="preserve">Pages intégrées : </w:t>
+      </w:r>
+      <w:r>
+        <w:t xml:space="preserve">Courses et Calendrier sont fixes et non supprimables ; les onglets « + Course » et « Plan » disparaissent. À droite : Importer, Doc, Sources.</w:t>
+      </w:r>
+    </w:p>
+    <w:p>
+      <w:pPr>
+        <w:pStyle w:val="ListParagraph"/>
+        <w:numPr>
+          <w:ilvl w:val="0"/>
+          <w:numId w:val="6"/>
+        </w:numPr>
+      </w:pPr>
+      <w:r>
+        <w:rPr>
+          <w:b/>
+        </w:rPr>
+        <w:t xml:space="preserve">Raccourcis : </w:t>
+      </w:r>
+      <w:r>
+        <w:t xml:space="preserve">pavé numérique 1–9 et rangée AZERTY du haut (&amp; é " ' ( - è _ ç à) pour les pages 1 à 10, désactivés pendant une saisie.</w:t>
+      </w:r>
+    </w:p>
+    <w:p>
+      <w:pPr>
+        <w:pStyle w:val="ListParagraph"/>
+        <w:numPr>
+          <w:ilvl w:val="0"/>
+          <w:numId w:val="6"/>
+        </w:numPr>
+      </w:pPr>
+      <w:r>
+        <w:rPr>
+          <w:b/>
+        </w:rPr>
+        <w:t xml:space="preserve">Correctif : </w:t>
+      </w:r>
+      <w:r>
+        <w:t xml:space="preserve">le menu ⋯ d'une page est rogné par la barre d'onglets ; il doit s'afficher en entier (rendu hors du conteneur).</w:t>
+      </w:r>
+    </w:p>
+    <w:p>
+      <w:pPr/>
+      <w:r>
+        <w:rPr>
+          <w:b/>
+        </w:rPr>
+        <w:t xml:space="preserve">Courses et plans</w:t>
+      </w:r>
+    </w:p>
+    <w:p>
+      <w:pPr>
+        <w:pStyle w:val="ListParagraph"/>
+        <w:numPr>
+          <w:ilvl w:val="0"/>
+          <w:numId w:val="6"/>
+        </w:numPr>
+      </w:pPr>
+      <w:r>
+        <w:rPr>
+          <w:b/>
+        </w:rPr>
+        <w:t xml:space="preserve">Plan : </w:t>
+      </w:r>
+      <w:r>
+        <w:t xml:space="preserve">objet nommé (nom, date de début et de fin, course liée facultative) auquel les séances sont rattachées. Les séances existantes sont regroupées dans un plan « Plan importé ».</w:t>
+      </w:r>
+    </w:p>
+    <w:p>
+      <w:pPr>
+        <w:pStyle w:val="ListParagraph"/>
+        <w:numPr>
+          <w:ilvl w:val="0"/>
+          <w:numId w:val="6"/>
+        </w:numPr>
+      </w:pPr>
+      <w:r>
+        <w:rPr>
+          <w:b/>
+        </w:rPr>
+        <w:t xml:space="preserve">Page Courses : </w:t>
+      </w:r>
+      <w:r>
+        <w:t xml:space="preserve">chaque course avec date, compte à rebours, distance, D+, profil altimétrique et plan attribué ; attribuer ou détacher un plan en un clic.</w:t>
+      </w:r>
+    </w:p>
+    <w:p>
+      <w:pPr>
+        <w:pStyle w:val="ListParagraph"/>
+        <w:numPr>
+          <w:ilvl w:val="0"/>
+          <w:numId w:val="6"/>
+        </w:numPr>
+      </w:pPr>
+      <w:r>
+        <w:rPr>
+          <w:b/>
+        </w:rPr>
+        <w:t xml:space="preserve">Plan suivant à l'avance : </w:t>
+      </w:r>
+      <w:r>
+        <w:t xml:space="preserve">importable sans écraser un autre plan ; les chevauchements sont signalés à l'aperçu et exigent une confirmation explicite.</w:t>
+      </w:r>
+    </w:p>
+    <w:p>
+      <w:pPr/>
+      <w:r>
+        <w:rPr>
+          <w:b/>
+        </w:rPr>
+        <w:t xml:space="preserve">Calendrier</w:t>
+      </w:r>
+    </w:p>
+    <w:p>
+      <w:pPr>
+        <w:pStyle w:val="ListParagraph"/>
+        <w:numPr>
+          <w:ilvl w:val="0"/>
+          <w:numId w:val="6"/>
+        </w:numPr>
+      </w:pPr>
+      <w:r>
+        <w:t xml:space="preserve">Vues semaine (par défaut) et mois, précédent / suivant / aujourd'hui, couleur par plan, séance prévue, activité réalisée et statut prévu/réalisé ; clic = détail de la séance. Le widget Semaine reçoit aussi les flèches de navigation. Aucun verdict ni alerte : des faits.</w:t>
+      </w:r>
+    </w:p>
+    <w:p>
+      <w:pPr/>
+      <w:r>
+        <w:rPr>
+          <w:b/>
+        </w:rPr>
+        <w:t xml:space="preserve">Import unique</w:t>
+      </w:r>
+    </w:p>
+    <w:p>
+      <w:pPr>
+        <w:pStyle w:val="ListParagraph"/>
+        <w:numPr>
+          <w:ilvl w:val="0"/>
+          <w:numId w:val="6"/>
+        </w:numPr>
+      </w:pPr>
+      <w:r>
+        <w:t xml:space="preserve">Un seul bouton Importer : coller le texte de Claude ou déposer un fichier. Détection automatique du contenu (plan, courses, matériel, saisies, notes ; plusieurs sections possibles dans un document, format version 2, version 1 conservée). Aperçu obligatoire sans rien écrire, erreurs en français, une confirmation. Un seul prompt d'import à donner au coach, copiable en un clic ; les boutons d'import des widgets utilisent le même moteur.</w:t>
+      </w:r>
+    </w:p>
+    <w:p>
+      <w:pPr/>
+      <w:r>
+        <w:rPr>
+          <w:b/>
+        </w:rPr>
+        <w:t xml:space="preserve">Synchronisation Garmin</w:t>
+      </w:r>
+    </w:p>
+    <w:p>
+      <w:pPr>
+        <w:pStyle w:val="ListParagraph"/>
+        <w:numPr>
+          <w:ilvl w:val="0"/>
+          <w:numId w:val="6"/>
+        </w:numPr>
+      </w:pPr>
+      <w:r>
+        <w:t xml:space="preserve">Synchronisation nocturne inchangée. Nouveau bouton « Vérifier les nouveautés » : récupère uniquement les activités plus récentes que la dernière en base (toutes celles en retard, en s'arrêtant à la première déjà connue), sans recharger l'historique ; repli Intervals.icu et déduplication inchangés.</w:t>
+      </w:r>
+    </w:p>
+    <w:p>
+      <w:pPr/>
+      <w:r>
+        <w:rPr>
+          <w:b/>
+        </w:rPr>
+        <w:t xml:space="preserve">Documentation visuelle</w:t>
+      </w:r>
+    </w:p>
+    <w:p>
+      <w:pPr>
+        <w:pStyle w:val="ListParagraph"/>
+        <w:numPr>
+          <w:ilvl w:val="0"/>
+          <w:numId w:val="6"/>
+        </w:numPr>
+      </w:pPr>
+      <w:r>
+        <w:t xml:space="preserve">Une fiche par widget avec aperçu visuel (rendu réel sur données d'exemple) dans une fenêtre modale, avec réglages, export, import et exemple. Bouton « Copier la doc pour mon agent » : un Markdown complet (widgets, formats d'import, exemples, prompt) pour préparer des imports multiples.</w:t>
+      </w:r>
+    </w:p>
+    <w:p>
+      <w:pPr/>
+      <w:r>
+        <w:rPr>
+          <w:b/>
+        </w:rPr>
+        <w:t xml:space="preserve">Critères de recette V2</w:t>
+      </w:r>
+    </w:p>
+    <w:p>
+      <w:pPr>
+        <w:pStyle w:val="ListParagraph"/>
+        <w:numPr>
+          <w:ilvl w:val="0"/>
+          <w:numId w:val="6"/>
+        </w:numPr>
+      </w:pPr>
+      <w:r>
+        <w:t xml:space="preserve">(1) Un plan de trois semaines collé puis validé apparaît dans le calendrier et sur la page Courses. (2) Le plan suivant s'importe sans toucher au premier. (3) Navigation semaine par semaine et mois par mois. (4) Les touches &amp; é " … changent de page et le menu ⋯ supprime une page. (5) « Vérifier les nouveautés » ramène 2–3 activités manquantes sans resynchroniser l'historique. (6) La Doc montre l'aperçu d'un widget et « Copier la doc » produit un Markdown complet.</w:t>
+      </w:r>
+    </w:p>
+    <w:p>
+      <w:pPr>
+        <w:pStyle w:val="Heading2"/>
+      </w:pPr>
+      <w:r>
+        <w:t xml:space="preserve">11. Questions ouvertes et sources</w:t>
       </w:r>
     </w:p>
     <w:p>

</xml_diff>